<commit_message>
docs: document the campus location list for add_item and update_item
The API documentation now lists the allowed location_lost / location_found values and the 422 error returned for anything else.
</commit_message>
<xml_diff>
--- a/docs/Group4_API_Documentation.docx
+++ b/docs/Group4_API_Documentation.docx
@@ -3170,6 +3170,72 @@
           <w:szCs w:val="19"/>
         </w:rPr>
         <w:t>id</w:t>
+      </w:r>
+      <w:r>
+        <w:t>.</w:t>
+      </w:r>
+    </w:p>
+    <w:p>
+      <w:pPr>
+        <w:spacing w:after="120" w:line="276" w:lineRule="auto"/>
+        <w:jc w:val="both"/>
+      </w:pPr>
+      <w:r>
+        <w:rPr>
+          <w:rFonts w:ascii="Consolas" w:eastAsia="Consolas" w:hAnsi="Consolas" w:cs="Consolas"/>
+          <w:color w:val="9A0C23"/>
+          <w:sz w:val="19"/>
+          <w:szCs w:val="19"/>
+        </w:rPr>
+        <w:t>location_lost</w:t>
+      </w:r>
+      <w:r>
+        <w:t xml:space="preserve"> and </w:t>
+      </w:r>
+      <w:r>
+        <w:rPr>
+          <w:rFonts w:ascii="Consolas" w:eastAsia="Consolas" w:hAnsi="Consolas" w:cs="Consolas"/>
+          <w:color w:val="9A0C23"/>
+          <w:sz w:val="19"/>
+          <w:szCs w:val="19"/>
+        </w:rPr>
+        <w:t>location_found</w:t>
+      </w:r>
+      <w:r>
+        <w:t xml:space="preserve"> must be exactly one of the campus locations the form offers as a dropdown (</w:t>
+      </w:r>
+      <w:r>
+        <w:rPr>
+          <w:rFonts w:ascii="Consolas" w:eastAsia="Consolas" w:hAnsi="Consolas" w:cs="Consolas"/>
+          <w:color w:val="9A0C23"/>
+          <w:sz w:val="19"/>
+          <w:szCs w:val="19"/>
+        </w:rPr>
+        <w:t>CAMPUS_LOCATIONS</w:t>
+      </w:r>
+      <w:r>
+        <w:t xml:space="preserve"> in </w:t>
+      </w:r>
+      <w:r>
+        <w:rPr>
+          <w:rFonts w:ascii="Consolas" w:eastAsia="Consolas" w:hAnsi="Consolas" w:cs="Consolas"/>
+          <w:color w:val="9A0C23"/>
+          <w:sz w:val="19"/>
+          <w:szCs w:val="19"/>
+        </w:rPr>
+        <w:t>config/config.php</w:t>
+      </w:r>
+      <w:r>
+        <w:t xml:space="preserve">): Main Entrance &amp; Lobby, Hallways &amp; Elevators, Classrooms, Computer Labs, Science &amp; Health Labs, Media Studios, Library, Student Lounge, Canteen &amp; Café, Gymnasium, Cinema, Prayer Room, Student Services Office, Restrooms, Parking Area, Other. Any other value is refused with HTTP 422 and </w:t>
+      </w:r>
+      <w:r>
+        <w:rPr>
+          <w:rFonts w:ascii="Consolas" w:eastAsia="Consolas" w:hAnsi="Consolas" w:cs="Consolas"/>
+          <w:color w:val="9A0C23"/>
+          <w:sz w:val="19"/>
+          <w:szCs w:val="19"/>
+        </w:rPr>
+        <w:t>"Choose a location from the list."</w:t>
       </w:r>
       <w:r>
         <w:t>.</w:t>

</xml_diff>

<commit_message>
docs: document storage locations, "Other" descriptions and the date range in the API docs
The add_item / update_item section now covers the category and location
lists, the *_other fields that describe an "Other" choice, the
STORAGE_LOCATIONS list and the one-year limit on date_lost / date_found.
The update_status section describes staff review of found-item posts.
</commit_message>
<xml_diff>
--- a/docs/Group4_API_Documentation.docx
+++ b/docs/Group4_API_Documentation.docx
@@ -416,7 +416,7 @@
               <w:rPr>
                 <w:noProof/>
               </w:rPr>
-              <w:t>5</w:t>
+              <w:t>6</w:t>
             </w:r>
             <w:r>
               <w:rPr>
@@ -548,7 +548,7 @@
               <w:rPr>
                 <w:noProof/>
               </w:rPr>
-              <w:t>6</w:t>
+              <w:t>7</w:t>
             </w:r>
             <w:r>
               <w:rPr>
@@ -614,7 +614,7 @@
               <w:rPr>
                 <w:noProof/>
               </w:rPr>
-              <w:t>6</w:t>
+              <w:t>7</w:t>
             </w:r>
             <w:r>
               <w:rPr>
@@ -878,7 +878,7 @@
               <w:rPr>
                 <w:noProof/>
               </w:rPr>
-              <w:t>7</w:t>
+              <w:t>8</w:t>
             </w:r>
             <w:r>
               <w:rPr>
@@ -944,7 +944,7 @@
               <w:rPr>
                 <w:noProof/>
               </w:rPr>
-              <w:t>7</w:t>
+              <w:t>8</w:t>
             </w:r>
             <w:r>
               <w:rPr>
@@ -983,10 +983,7 @@
         <w:jc w:val="both"/>
       </w:pPr>
       <w:r>
-        <w:t>CLAFS uses two APIs. The first is the CLAFS JSON API — a set of PHP endpoints in the api</w:t>
-      </w:r>
-      <w:r>
-        <w:t>/ folder that the website’s own JavaScript calls with fetch() to read and write lost-and-found records without reloading the page. The second is an external, third-party API — Nager.Date public holidays — which the browser calls directly to show when the Lost &amp; Found office is closed.</w:t>
+        <w:t>CLAFS uses two APIs. The first is the CLAFS JSON API — a set of PHP endpoints in the api/ folder that the website’s own JavaScript calls with fetch() to read and write lost-and-found records without reloading the page. The second is an external, third-party API — Nager.Date public holidays — which the browser calls directly to show when the Lost &amp; Found office is closed.</w:t>
       </w:r>
     </w:p>
     <w:tbl>
@@ -2728,15 +2725,7 @@
                 <w:sz w:val="18"/>
                 <w:szCs w:val="18"/>
               </w:rPr>
-              <w:t xml:space="preserve">                                       "errors": </w:t>
-            </w:r>
-            <w:r>
-              <w:rPr>
-                <w:rFonts w:ascii="Consolas" w:eastAsia="Consolas" w:hAnsi="Consolas" w:cs="Consolas"/>
-                <w:sz w:val="18"/>
-                <w:szCs w:val="18"/>
-              </w:rPr>
-              <w:t>{ "description": "Must be at least 20 characters." } }</w:t>
+              <w:t xml:space="preserve">                                       "errors": { "description": "Must be at least 20 characters." } }</w:t>
             </w:r>
           </w:p>
         </w:tc>
@@ -3157,10 +3146,7 @@
         <w:t>photo</w:t>
       </w:r>
       <w:r>
-        <w:t>. update_item.php</w:t>
-      </w:r>
-      <w:r>
-        <w:t xml:space="preserve"> also takes </w:t>
+        <w:t xml:space="preserve">. update_item.php also takes </w:t>
       </w:r>
       <w:r>
         <w:rPr>
@@ -3187,10 +3173,35 @@
           <w:sz w:val="19"/>
           <w:szCs w:val="19"/>
         </w:rPr>
+        <w:lastRenderedPageBreak/>
+        <w:t>category</w:t>
+      </w:r>
+      <w:r>
+        <w:t xml:space="preserve"> must be one of </w:t>
+      </w:r>
+      <w:r>
+        <w:rPr>
+          <w:rFonts w:ascii="Consolas" w:eastAsia="Consolas" w:hAnsi="Consolas" w:cs="Consolas"/>
+          <w:color w:val="9A0C23"/>
+          <w:sz w:val="19"/>
+          <w:szCs w:val="19"/>
+        </w:rPr>
+        <w:t>CATEGORIES</w:t>
+      </w:r>
+      <w:r>
+        <w:t xml:space="preserve"> and </w:t>
+      </w:r>
+      <w:r>
+        <w:rPr>
+          <w:rFonts w:ascii="Consolas" w:eastAsia="Consolas" w:hAnsi="Consolas" w:cs="Consolas"/>
+          <w:color w:val="9A0C23"/>
+          <w:sz w:val="19"/>
+          <w:szCs w:val="19"/>
+        </w:rPr>
         <w:t>location_lost</w:t>
       </w:r>
       <w:r>
-        <w:t xml:space="preserve"> and </w:t>
+        <w:t xml:space="preserve"> / </w:t>
       </w:r>
       <w:r>
         <w:rPr>
@@ -3202,7 +3213,7 @@
         <w:t>location_found</w:t>
       </w:r>
       <w:r>
-        <w:t xml:space="preserve"> must be exactly one of the campus locations the form offers as a dropdown (</w:t>
+        <w:t xml:space="preserve"> one of the campus locations (</w:t>
       </w:r>
       <w:r>
         <w:rPr>
@@ -3235,10 +3246,187 @@
           <w:sz w:val="19"/>
           <w:szCs w:val="19"/>
         </w:rPr>
+        <w:t>"Choose a valid category."</w:t>
+      </w:r>
+      <w:r>
+        <w:t xml:space="preserve"> or </w:t>
+      </w:r>
+      <w:r>
+        <w:rPr>
+          <w:rFonts w:ascii="Consolas" w:eastAsia="Consolas" w:hAnsi="Consolas" w:cs="Consolas"/>
+          <w:color w:val="9A0C23"/>
+          <w:sz w:val="19"/>
+          <w:szCs w:val="19"/>
+        </w:rPr>
         <w:t>"Choose a location from the list."</w:t>
       </w:r>
       <w:r>
         <w:t>.</w:t>
+      </w:r>
+    </w:p>
+    <w:p>
+      <w:pPr>
+        <w:spacing w:after="120" w:line="276" w:lineRule="auto"/>
+        <w:jc w:val="both"/>
+      </w:pPr>
+      <w:r>
+        <w:t xml:space="preserve">Choosing Other requires a description in </w:t>
+      </w:r>
+      <w:r>
+        <w:rPr>
+          <w:rFonts w:ascii="Consolas" w:eastAsia="Consolas" w:hAnsi="Consolas" w:cs="Consolas"/>
+          <w:color w:val="9A0C23"/>
+          <w:sz w:val="19"/>
+          <w:szCs w:val="19"/>
+        </w:rPr>
+        <w:t>category_other</w:t>
+      </w:r>
+      <w:r>
+        <w:t xml:space="preserve">, </w:t>
+      </w:r>
+      <w:r>
+        <w:rPr>
+          <w:rFonts w:ascii="Consolas" w:eastAsia="Consolas" w:hAnsi="Consolas" w:cs="Consolas"/>
+          <w:color w:val="9A0C23"/>
+          <w:sz w:val="19"/>
+          <w:szCs w:val="19"/>
+        </w:rPr>
+        <w:t>location_lost_other</w:t>
+      </w:r>
+      <w:r>
+        <w:t xml:space="preserve"> or </w:t>
+      </w:r>
+      <w:r>
+        <w:rPr>
+          <w:rFonts w:ascii="Consolas" w:eastAsia="Consolas" w:hAnsi="Consolas" w:cs="Consolas"/>
+          <w:color w:val="9A0C23"/>
+          <w:sz w:val="19"/>
+          <w:szCs w:val="19"/>
+        </w:rPr>
+        <w:t>location_found_other</w:t>
+      </w:r>
+      <w:r>
+        <w:t xml:space="preserve"> (up to 50 characters for a category, 150 for a location). That text is stored in place of "Other"; if it is missing, HTTP 422 with </w:t>
+      </w:r>
+      <w:r>
+        <w:rPr>
+          <w:rFonts w:ascii="Consolas" w:eastAsia="Consolas" w:hAnsi="Consolas" w:cs="Consolas"/>
+          <w:color w:val="9A0C23"/>
+          <w:sz w:val="19"/>
+          <w:szCs w:val="19"/>
+        </w:rPr>
+        <w:t>"Describe what "Other" is."</w:t>
+      </w:r>
+      <w:r>
+        <w:t xml:space="preserve"> on the </w:t>
+      </w:r>
+      <w:r>
+        <w:rPr>
+          <w:rFonts w:ascii="Consolas" w:eastAsia="Consolas" w:hAnsi="Consolas" w:cs="Consolas"/>
+          <w:color w:val="9A0C23"/>
+          <w:sz w:val="19"/>
+          <w:szCs w:val="19"/>
+        </w:rPr>
+        <w:t>_other</w:t>
+      </w:r>
+      <w:r>
+        <w:t xml:space="preserve"> field. The form keeps the text box disabled unless Other is selected. Category filters and the statistics count these typed values as Other.</w:t>
+      </w:r>
+    </w:p>
+    <w:p>
+      <w:pPr>
+        <w:spacing w:after="120" w:line="276" w:lineRule="auto"/>
+        <w:jc w:val="both"/>
+      </w:pPr>
+      <w:r>
+        <w:rPr>
+          <w:rFonts w:ascii="Consolas" w:eastAsia="Consolas" w:hAnsi="Consolas" w:cs="Consolas"/>
+          <w:color w:val="9A0C23"/>
+          <w:sz w:val="19"/>
+          <w:szCs w:val="19"/>
+        </w:rPr>
+        <w:t>storage_location</w:t>
+      </w:r>
+      <w:r>
+        <w:t xml:space="preserve"> (staff intake and edit) must be one of </w:t>
+      </w:r>
+      <w:r>
+        <w:rPr>
+          <w:rFonts w:ascii="Consolas" w:eastAsia="Consolas" w:hAnsi="Consolas" w:cs="Consolas"/>
+          <w:color w:val="9A0C23"/>
+          <w:sz w:val="19"/>
+          <w:szCs w:val="19"/>
+        </w:rPr>
+        <w:t>STORAGE_LOCATIONS</w:t>
+      </w:r>
+      <w:r>
+        <w:t xml:space="preserve">: Cabinet A, Shelf 1; Cabinet B, Shelf 2; Cabinet C, Shelf 1; Drawer 1 (IDs); Drawer 2 (Keys); Bin 4 (Misc). Anything else gets HTTP 422 and </w:t>
+      </w:r>
+      <w:r>
+        <w:rPr>
+          <w:rFonts w:ascii="Consolas" w:eastAsia="Consolas" w:hAnsi="Consolas" w:cs="Consolas"/>
+          <w:color w:val="9A0C23"/>
+          <w:sz w:val="19"/>
+          <w:szCs w:val="19"/>
+        </w:rPr>
+        <w:t>"Choose a storage location from the list."</w:t>
+      </w:r>
+      <w:r>
+        <w:t>.</w:t>
+      </w:r>
+    </w:p>
+    <w:p>
+      <w:pPr>
+        <w:spacing w:after="120" w:line="276" w:lineRule="auto"/>
+        <w:jc w:val="both"/>
+      </w:pPr>
+      <w:r>
+        <w:rPr>
+          <w:rFonts w:ascii="Consolas" w:eastAsia="Consolas" w:hAnsi="Consolas" w:cs="Consolas"/>
+          <w:color w:val="9A0C23"/>
+          <w:sz w:val="19"/>
+          <w:szCs w:val="19"/>
+        </w:rPr>
+        <w:t>date_lost</w:t>
+      </w:r>
+      <w:r>
+        <w:t xml:space="preserve"> / </w:t>
+      </w:r>
+      <w:r>
+        <w:rPr>
+          <w:rFonts w:ascii="Consolas" w:eastAsia="Consolas" w:hAnsi="Consolas" w:cs="Consolas"/>
+          <w:color w:val="9A0C23"/>
+          <w:sz w:val="19"/>
+          <w:szCs w:val="19"/>
+        </w:rPr>
+        <w:t>date_found</w:t>
+      </w:r>
+      <w:r>
+        <w:t xml:space="preserve"> must be between one year ago and today: a later date gets </w:t>
+      </w:r>
+      <w:r>
+        <w:rPr>
+          <w:rFonts w:ascii="Consolas" w:eastAsia="Consolas" w:hAnsi="Consolas" w:cs="Consolas"/>
+          <w:color w:val="9A0C23"/>
+          <w:sz w:val="19"/>
+          <w:szCs w:val="19"/>
+        </w:rPr>
+        <w:t>"Date cannot be in the future."</w:t>
+      </w:r>
+      <w:r>
+        <w:t xml:space="preserve">, an earlier one </w:t>
+      </w:r>
+      <w:r>
+        <w:rPr>
+          <w:rFonts w:ascii="Consolas" w:eastAsia="Consolas" w:hAnsi="Consolas" w:cs="Consolas"/>
+          <w:color w:val="9A0C23"/>
+          <w:sz w:val="19"/>
+          <w:szCs w:val="19"/>
+        </w:rPr>
+        <w:t>"Date cannot be more than a year ago."</w:t>
+      </w:r>
+      <w:r>
+        <w:t xml:space="preserve"> (HTTP 422).</w:t>
       </w:r>
     </w:p>
     <w:tbl>
@@ -3590,6 +3778,7 @@
                 <w:sz w:val="18"/>
                 <w:szCs w:val="18"/>
               </w:rPr>
+              <w:lastRenderedPageBreak/>
               <w:t>{ "type": "found", "id": 2, "status": "returned" }</w:t>
             </w:r>
           </w:p>
@@ -3633,6 +3822,7 @@
         <w:jc w:val="both"/>
       </w:pPr>
       <w:r>
+        <w:lastRenderedPageBreak/>
         <w:t xml:space="preserve">For lost reports, </w:t>
       </w:r>
       <w:r>
@@ -3670,6 +3860,63 @@
       </w:r>
       <w:r>
         <w:t xml:space="preserve"> and shown to the owner.</w:t>
+      </w:r>
+    </w:p>
+    <w:p>
+      <w:pPr>
+        <w:spacing w:before="120" w:after="120"/>
+        <w:jc w:val="both"/>
+      </w:pPr>
+      <w:r>
+        <w:t xml:space="preserve">Staff review a student's found-item post with </w:t>
+      </w:r>
+      <w:r>
+        <w:rPr>
+          <w:rFonts w:ascii="Consolas" w:eastAsia="Consolas" w:hAnsi="Consolas" w:cs="Consolas"/>
+          <w:color w:val="9A0C23"/>
+          <w:sz w:val="19"/>
+          <w:szCs w:val="19"/>
+        </w:rPr>
+        <w:t>{ "type": "found", "id": 7, "moderation": "approved" | "rejected", "storage_location": "Drawer 1 (IDs)", "review_note": "..." }</w:t>
+      </w:r>
+      <w:r>
+        <w:t xml:space="preserve">. Approving needs a </w:t>
+      </w:r>
+      <w:r>
+        <w:rPr>
+          <w:rFonts w:ascii="Consolas" w:eastAsia="Consolas" w:hAnsi="Consolas" w:cs="Consolas"/>
+          <w:color w:val="9A0C23"/>
+          <w:sz w:val="19"/>
+          <w:szCs w:val="19"/>
+        </w:rPr>
+        <w:t>storage_location</w:t>
+      </w:r>
+      <w:r>
+        <w:t xml:space="preserve"> from </w:t>
+      </w:r>
+      <w:r>
+        <w:rPr>
+          <w:rFonts w:ascii="Consolas" w:eastAsia="Consolas" w:hAnsi="Consolas" w:cs="Consolas"/>
+          <w:color w:val="9A0C23"/>
+          <w:sz w:val="19"/>
+          <w:szCs w:val="19"/>
+        </w:rPr>
+        <w:t>STORAGE_LOCATIONS</w:t>
+      </w:r>
+      <w:r>
+        <w:t xml:space="preserve">; rejecting needs a </w:t>
+      </w:r>
+      <w:r>
+        <w:rPr>
+          <w:rFonts w:ascii="Consolas" w:eastAsia="Consolas" w:hAnsi="Consolas" w:cs="Consolas"/>
+          <w:color w:val="9A0C23"/>
+          <w:sz w:val="19"/>
+          <w:szCs w:val="19"/>
+        </w:rPr>
+        <w:t>review_note</w:t>
+      </w:r>
+      <w:r>
+        <w:t xml:space="preserve"> of at least 10 characters. Otherwise HTTP 422 with the field in errors. On the item page the Approve and Reject buttons stay disabled until their field is filled in.</w:t>
       </w:r>
     </w:p>
     <w:p>
@@ -3723,15 +3970,7 @@
                 <w:sz w:val="18"/>
                 <w:szCs w:val="18"/>
               </w:rPr>
-              <w:t>{ "action": "create",   "item_id": 4, "</w:t>
-            </w:r>
-            <w:r>
-              <w:rPr>
-                <w:rFonts w:ascii="Consolas" w:eastAsia="Consolas" w:hAnsi="Consolas" w:cs="Consolas"/>
-                <w:sz w:val="18"/>
-                <w:szCs w:val="18"/>
-              </w:rPr>
-              <w:t>proof_description": "...", "report_id": 1, "confirm_truth": 1 }</w:t>
+              <w:t>{ "action": "create",   "item_id": 4, "proof_description": "...", "report_id": 1, "confirm_truth": 1 }</w:t>
             </w:r>
           </w:p>
           <w:p>
@@ -3869,16 +4108,7 @@
                 <w:sz w:val="18"/>
                 <w:szCs w:val="18"/>
               </w:rPr>
-              <w:lastRenderedPageBreak/>
-              <w:t>{ "ok": true, "user_id</w:t>
-            </w:r>
-            <w:r>
-              <w:rPr>
-                <w:rFonts w:ascii="Consolas" w:eastAsia="Consolas" w:hAnsi="Consolas" w:cs="Consolas"/>
-                <w:sz w:val="18"/>
-                <w:szCs w:val="18"/>
-              </w:rPr>
-              <w:t>": 4, "role": "staff", "is_active": 1, "message": "Bea Lim: role set to Security &amp; Maintenance." }</w:t>
+              <w:t>{ "ok": true, "user_id": 4, "role": "staff", "is_active": 1, "message": "Bea Lim: role set to Security &amp; Maintenance." }</w:t>
             </w:r>
           </w:p>
         </w:tc>
@@ -4093,6 +4323,7 @@
                 <w:sz w:val="18"/>
                 <w:szCs w:val="18"/>
               </w:rPr>
+              <w:lastRenderedPageBreak/>
               <w:t xml:space="preserve">              number 2, so their account has been deactivated and logged out." }</w:t>
             </w:r>
           </w:p>
@@ -4297,14 +4528,7 @@
                 <w:sz w:val="19"/>
                 <w:szCs w:val="19"/>
               </w:rPr>
-              <w:t>Array of found items (item_id, item_name, category, description, location_found, date_found, image_url</w:t>
-            </w:r>
-            <w:r>
-              <w:rPr>
-                <w:sz w:val="19"/>
-                <w:szCs w:val="19"/>
-              </w:rPr>
-              <w:t>, status) or lost reports. Staff also receive storage_location and private_details.</w:t>
+              <w:t>Array of found items (item_id, item_name, category, description, location_found, date_found, image_url, status) or lost reports. Staff also receive storage_location and private_details.</w:t>
             </w:r>
           </w:p>
         </w:tc>
@@ -4797,7 +5021,6 @@
       </w:pPr>
       <w:bookmarkStart w:id="5" w:name="_Toc241969554"/>
       <w:r>
-        <w:lastRenderedPageBreak/>
         <w:t>2.4 How the API is integrated into the website</w:t>
       </w:r>
       <w:bookmarkEnd w:id="5"/>
@@ -4944,10 +5167,7 @@
         <w:t>fetch()</w:t>
       </w:r>
       <w:r>
-        <w:t>, sends JSON or FormData</w:t>
-      </w:r>
-      <w:r>
-        <w:t xml:space="preserve">, parses the JSON reply, and rejects with an Error that carries the HTTP status and the field errors when the server says </w:t>
+        <w:t xml:space="preserve">, sends JSON or FormData, parses the JSON reply, and rejects with an Error that carries the HTTP status and the field errors when the server says </w:t>
       </w:r>
       <w:r>
         <w:rPr>
@@ -5170,7 +5390,11 @@
         <w:t>app.js</w:t>
       </w:r>
       <w:r>
-        <w:t xml:space="preserve"> intercepts its submit event, runs client-side validation, calls the matching </w:t>
+        <w:t xml:space="preserve"> intercepts its submit event, runs client-side validation, </w:t>
+      </w:r>
+      <w:r>
+        <w:lastRenderedPageBreak/>
+        <w:t xml:space="preserve">calls the matching </w:t>
       </w:r>
       <w:r>
         <w:rPr>
@@ -5697,16 +5921,7 @@
           <w:sz w:val="19"/>
           <w:szCs w:val="19"/>
         </w:rPr>
-        <w:t>ClafsApi.getHolidays</w:t>
-      </w:r>
-      <w:r>
-        <w:rPr>
-          <w:rFonts w:ascii="Consolas" w:eastAsia="Consolas" w:hAnsi="Consolas" w:cs="Consolas"/>
-          <w:color w:val="9A0C23"/>
-          <w:sz w:val="19"/>
-          <w:szCs w:val="19"/>
-        </w:rPr>
-        <w:t>(year)</w:t>
+        <w:t>ClafsApi.getHolidays(year)</w:t>
       </w:r>
       <w:r>
         <w:t xml:space="preserve">, which fetches the endpoint above with </w:t>
@@ -6618,14 +6833,7 @@
                 <w:sz w:val="19"/>
                 <w:szCs w:val="19"/>
               </w:rPr>
-              <w:t xml:space="preserve">POST </w:t>
-            </w:r>
-            <w:r>
-              <w:rPr>
-                <w:sz w:val="19"/>
-                <w:szCs w:val="19"/>
-              </w:rPr>
-              <w:t>update_user.php</w:t>
+              <w:t>POST update_user.php</w:t>
             </w:r>
           </w:p>
         </w:tc>
@@ -6732,6 +6940,7 @@
         <w:jc w:val="both"/>
       </w:pPr>
       <w:r>
+        <w:lastRenderedPageBreak/>
         <w:t>Open the browser’s developer tools (F12 → Network tab) while doing any of the above to watch the fetch() requests and JSON responses.</w:t>
       </w:r>
     </w:p>

</xml_diff>

<commit_message>
refactor: trim over-engineering and fix migration-015 leftovers
Fixes:
- Log hand-over rejections against the claimant (claimant_id, not user_id)
- get_items.php: public fields come from an allow list (added_by leaked)
- Hide database connection details on the production error page

Cleanup:
- Split index.php into one templates/dashboard/<tab>.php per section
- Live search fetches browse.php instead of rebuilding cards in JS
- Replace the cookie consent banner (Reject blocked log-in) with a footer note
- Send the email typo lists to app.js through clafs-config, one copy
- moderate_report() uses in_transaction(); shared dashboard_returns()
- Drop unused previous/rejected_claims fields from update_status.php
- Drop redirects for old browse.php and index.php URLs
- Update API docs (docx and PDF) to match
</commit_message>
<xml_diff>
--- a/docs/Group4_API_Documentation.docx
+++ b/docs/Group4_API_Documentation.docx
@@ -3778,8 +3778,7 @@
                 <w:sz w:val="18"/>
                 <w:szCs w:val="18"/>
               </w:rPr>
-              <w:lastRenderedPageBreak/>
-              <w:t>{ "type": "found", "id": 2, "status": "returned" }</w:t>
+              <w:t>{ "type": "lost", "id": 9, "status": "closed" }</w:t>
             </w:r>
           </w:p>
           <w:p>
@@ -3797,7 +3796,7 @@
                 <w:sz w:val="18"/>
                 <w:szCs w:val="18"/>
               </w:rPr>
-              <w:t>{ "ok": true, "type": "found", "id": 2, "previous": "stored", "status": "returned",</w:t>
+              <w:t>{ "ok": true, "type": "lost", "id": 9, "status": "closed",</w:t>
             </w:r>
           </w:p>
           <w:p>
@@ -3810,7 +3809,7 @@
                 <w:sz w:val="18"/>
                 <w:szCs w:val="18"/>
               </w:rPr>
-              <w:t xml:space="preserve">  "message": "Item #2 is now “Returned”.", "rejected_claims": [3] }</w:t>
+              <w:t xml:space="preserve">  "message": "Report #9 is now “Closed”." }</w:t>
             </w:r>
           </w:p>
         </w:tc>
@@ -4706,7 +4705,7 @@
                 <w:sz w:val="19"/>
                 <w:szCs w:val="19"/>
               </w:rPr>
-              <w:t>New and previous status, a message, ids of claims auto-rejected</w:t>
+              <w:t>Record type and id, its new status and a message</w:t>
             </w:r>
           </w:p>
         </w:tc>
@@ -5515,19 +5514,19 @@
         <w:t>data-live-search</w:t>
       </w:r>
       <w:r>
-        <w:t xml:space="preserve">. Typing in the keyword box (debounced 300 ms) or changing a filter calls </w:t>
-      </w:r>
-      <w:r>
-        <w:rPr>
-          <w:rFonts w:ascii="Consolas" w:eastAsia="Consolas" w:hAnsi="Consolas" w:cs="Consolas"/>
-          <w:color w:val="9A0C23"/>
-          <w:sz w:val="19"/>
-          <w:szCs w:val="19"/>
-        </w:rPr>
-        <w:t>ClafsApi.getItems()</w:t>
-      </w:r>
-      <w:r>
-        <w:t xml:space="preserve">, and the returned items are rendered into cards by JavaScript; the URL is updated with </w:t>
+        <w:t xml:space="preserve">. Typing in the keyword box (debounced 300 ms) or changing a filter fetches </w:t>
+      </w:r>
+      <w:r>
+        <w:rPr>
+          <w:rFonts w:ascii="Consolas" w:eastAsia="Consolas" w:hAnsi="Consolas" w:cs="Consolas"/>
+          <w:color w:val="9A0C23"/>
+          <w:sz w:val="19"/>
+          <w:szCs w:val="19"/>
+        </w:rPr>
+        <w:t>browse.php</w:t>
+      </w:r>
+      <w:r>
+        <w:t xml:space="preserve"> with the same filters and swaps in its result cards, so the cards come from the same PHP template as a normal page load; the URL is updated with </w:t>
       </w:r>
       <w:r>
         <w:rPr>
@@ -6299,7 +6298,7 @@
                 <w:sz w:val="19"/>
                 <w:szCs w:val="19"/>
               </w:rPr>
-              <w:t>GET get_items.php — cards update without reload</w:t>
+              <w:t>GET browse.php (same page, same filters) – cards update without reload</w:t>
             </w:r>
           </w:p>
         </w:tc>

</xml_diff>